<commit_message>
Add Table S3 (condensed sample-size) and fix S1 border thickness
Table S3: condensed companion to Table S5, same pmsampsize source data,
8 columns instead of 12 (drops Cox-Snell R2/Events Required/EPP
Required/Events Actual). Every value cross-checked in-script against the
user-supplied target table before saving - exact match, all 5 cohorts.

Table S1: top/foot rule thickness was 12 (vs 18 everywhere else, from
src/25_tables_1_2.py's THICK constant), making its lines visibly thinner
than S3/S4/S5/S6. Fixed to 18 for consistency across all appendix tables.
</commit_message>
<xml_diff>
--- a/outputs/Table_S1_Predictors.docx
+++ b/outputs/Table_S1_Predictors.docx
@@ -53,7 +53,7 @@
               <w:right w:w="100" w:type="dxa"/>
             </w:tcMar>
             <w:tcBorders>
-              <w:top w:val="single" w:sz="12" w:space="0" w:color="000000"/>
+              <w:top w:val="single" w:sz="18" w:space="0" w:color="000000"/>
               <w:bottom w:val="single" w:sz="8" w:space="0" w:color="000000"/>
               <w:left w:val="nil" w:sz="0" w:space="0" w:color="000000"/>
               <w:right w:val="nil" w:sz="0" w:space="0" w:color="000000"/>
@@ -84,7 +84,7 @@
               <w:right w:w="100" w:type="dxa"/>
             </w:tcMar>
             <w:tcBorders>
-              <w:top w:val="single" w:sz="12" w:space="0" w:color="000000"/>
+              <w:top w:val="single" w:sz="18" w:space="0" w:color="000000"/>
               <w:bottom w:val="single" w:sz="8" w:space="0" w:color="000000"/>
               <w:left w:val="nil" w:sz="0" w:space="0" w:color="000000"/>
               <w:right w:val="nil" w:sz="0" w:space="0" w:color="000000"/>
@@ -115,7 +115,7 @@
               <w:right w:w="100" w:type="dxa"/>
             </w:tcMar>
             <w:tcBorders>
-              <w:top w:val="single" w:sz="12" w:space="0" w:color="000000"/>
+              <w:top w:val="single" w:sz="18" w:space="0" w:color="000000"/>
               <w:bottom w:val="single" w:sz="8" w:space="0" w:color="000000"/>
               <w:left w:val="nil" w:sz="0" w:space="0" w:color="000000"/>
               <w:right w:val="nil" w:sz="0" w:space="0" w:color="000000"/>
@@ -146,7 +146,7 @@
               <w:right w:w="100" w:type="dxa"/>
             </w:tcMar>
             <w:tcBorders>
-              <w:top w:val="single" w:sz="12" w:space="0" w:color="000000"/>
+              <w:top w:val="single" w:sz="18" w:space="0" w:color="000000"/>
               <w:bottom w:val="single" w:sz="8" w:space="0" w:color="000000"/>
               <w:left w:val="nil" w:sz="0" w:space="0" w:color="000000"/>
               <w:right w:val="nil" w:sz="0" w:space="0" w:color="000000"/>
@@ -177,7 +177,7 @@
               <w:right w:w="100" w:type="dxa"/>
             </w:tcMar>
             <w:tcBorders>
-              <w:top w:val="single" w:sz="12" w:space="0" w:color="000000"/>
+              <w:top w:val="single" w:sz="18" w:space="0" w:color="000000"/>
               <w:bottom w:val="single" w:sz="8" w:space="0" w:color="000000"/>
               <w:left w:val="nil" w:sz="0" w:space="0" w:color="000000"/>
               <w:right w:val="nil" w:sz="0" w:space="0" w:color="000000"/>
@@ -854,7 +854,7 @@
             </w:tcMar>
             <w:tcBorders>
               <w:top w:val="nil" w:sz="0" w:space="0" w:color="000000"/>
-              <w:bottom w:val="single" w:sz="12" w:space="0" w:color="000000"/>
+              <w:bottom w:val="single" w:sz="18" w:space="0" w:color="000000"/>
               <w:left w:val="nil" w:sz="0" w:space="0" w:color="000000"/>
               <w:right w:val="nil" w:sz="0" w:space="0" w:color="000000"/>
             </w:tcBorders>
@@ -885,7 +885,7 @@
             </w:tcMar>
             <w:tcBorders>
               <w:top w:val="nil" w:sz="0" w:space="0" w:color="000000"/>
-              <w:bottom w:val="single" w:sz="12" w:space="0" w:color="000000"/>
+              <w:bottom w:val="single" w:sz="18" w:space="0" w:color="000000"/>
               <w:left w:val="nil" w:sz="0" w:space="0" w:color="000000"/>
               <w:right w:val="nil" w:sz="0" w:space="0" w:color="000000"/>
             </w:tcBorders>
@@ -916,7 +916,7 @@
             </w:tcMar>
             <w:tcBorders>
               <w:top w:val="nil" w:sz="0" w:space="0" w:color="000000"/>
-              <w:bottom w:val="single" w:sz="12" w:space="0" w:color="000000"/>
+              <w:bottom w:val="single" w:sz="18" w:space="0" w:color="000000"/>
               <w:left w:val="nil" w:sz="0" w:space="0" w:color="000000"/>
               <w:right w:val="nil" w:sz="0" w:space="0" w:color="000000"/>
             </w:tcBorders>
@@ -947,7 +947,7 @@
             </w:tcMar>
             <w:tcBorders>
               <w:top w:val="nil" w:sz="0" w:space="0" w:color="000000"/>
-              <w:bottom w:val="single" w:sz="12" w:space="0" w:color="000000"/>
+              <w:bottom w:val="single" w:sz="18" w:space="0" w:color="000000"/>
               <w:left w:val="nil" w:sz="0" w:space="0" w:color="000000"/>
               <w:right w:val="nil" w:sz="0" w:space="0" w:color="000000"/>
             </w:tcBorders>
@@ -978,7 +978,7 @@
             </w:tcMar>
             <w:tcBorders>
               <w:top w:val="nil" w:sz="0" w:space="0" w:color="000000"/>
-              <w:bottom w:val="single" w:sz="12" w:space="0" w:color="000000"/>
+              <w:bottom w:val="single" w:sz="18" w:space="0" w:color="000000"/>
               <w:left w:val="nil" w:sz="0" w:space="0" w:color="000000"/>
               <w:right w:val="nil" w:sz="0" w:space="0" w:color="000000"/>
             </w:tcBorders>

</xml_diff>